<commit_message>
Fase 4: validacao final com 5 cameras, secao 10.3 (limite termico e mitigacao) e monitor de GPU
</commit_message>
<xml_diff>
--- a/entregaveis/Documentacao_Fase4_Tortuga.docx
+++ b/entregaveis/Documentacao_Fase4_Tortuga.docx
@@ -227,7 +227,7 @@
       </w:pPr>
       <w:r>
         <w:lastRenderedPageBreak/>
-        <w:t>Para operar várias estações em uma única placa, a análise de postura é suspensa automaticamente quando a janela da estação é minimizada, e retomada ao voltar ao primeiro plano — comportamento inspirado na multitarefa de sistemas móveis. A degradação é segura: se a verificação falhar, a análise permanece ativa. As janelas abrem em cascata, evitando que estações se sobreponham.</w:t>
+        <w:t>Para operar várias estações em uma única placa, a análise de postura é suspensa automaticamente quando a janela da estação é minimizada, e retomada ao voltar ao primeiro plano — comportamento inspirado na multitarefa de sistemas móveis. A degradação é segura: se a verificação falhar, a análise permanece ativa. As janelas abrem em cascata, evitando que estações se sobreponham. Essa gestão de carga é também a principal defesa contra limitação térmica em equipamento portátil, como documentado na seção 10.3.</w:t>
       </w:r>
     </w:p>
     <w:p>
@@ -370,11 +370,8 @@
         <w:jc w:val="both"/>
       </w:pPr>
       <w:r>
-        <w:t xml:space="preserve">Cada evento entra em uma cadeia append-only encadeada por hash: adulterar ou remover qualquer registro quebra a cadeia, o que é detectado na verificação. A exportação é assinada e filtrável por operador, </w:t>
-      </w:r>
-      <w:r>
         <w:lastRenderedPageBreak/>
-        <w:t>estação, turno e área, em CSV e HTML. A partir desta fase, o parâmetro de medição (limiar de confiança) integra o conteúdo assinado, de modo que a trilha registra não apenas o que foi medido, mas em que condição.</w:t>
+        <w:t>Cada evento entra em uma cadeia append-only encadeada por hash: adulterar ou remover qualquer registro quebra a cadeia, o que é detectado na verificação. A exportação é assinada e filtrável por operador, estação, turno e área, em CSV e HTML. A partir desta fase, o parâmetro de medição (limiar de confiança) integra o conteúdo assinado, de modo que a trilha registra não apenas o que foi medido, mas em que condição.</w:t>
       </w:r>
     </w:p>
     <w:p>
@@ -515,7 +512,7 @@
               <w:rPr>
                 <w:sz w:val="19"/>
               </w:rPr>
-              <w:t>Duas estações estáveis a 15 quadros/s</w:t>
+              <w:t>Cinco estações simultâneas a 30 quadros/s</w:t>
             </w:r>
           </w:p>
         </w:tc>
@@ -530,7 +527,7 @@
               <w:rPr>
                 <w:sz w:val="19"/>
               </w:rPr>
-              <w:t>Detecção de pessoas em cena real</w:t>
+              <w:t>Detecção de EPI em cena real</w:t>
             </w:r>
           </w:p>
         </w:tc>
@@ -543,7 +540,35 @@
               <w:rPr>
                 <w:sz w:val="19"/>
               </w:rPr>
-              <w:t>Três pessoas simultâneas, confiança de 69% a 83%</w:t>
+              <w:t>Ausência de capacete identificada em dois operadores ao mesmo tempo</w:t>
+            </w:r>
+          </w:p>
+        </w:tc>
+      </w:tr>
+      <w:tr>
+        <w:tc>
+          <w:tcPr>
+            <w:tcW w:w="5040" w:type="dxa"/>
+          </w:tcPr>
+          <w:p>
+            <w:r>
+              <w:rPr>
+                <w:sz w:val="19"/>
+              </w:rPr>
+              <w:t>Análise de postura (Fase 2)</w:t>
+            </w:r>
+          </w:p>
+        </w:tc>
+        <w:tc>
+          <w:tcPr>
+            <w:tcW w:w="5040" w:type="dxa"/>
+          </w:tcPr>
+          <w:p>
+            <w:r>
+              <w:rPr>
+                <w:sz w:val="19"/>
+              </w:rPr>
+              <w:t>Esqueleto e índice RULA calculados ao vivo sobre a cena real</w:t>
             </w:r>
           </w:p>
         </w:tc>
@@ -571,7 +596,7 @@
               <w:rPr>
                 <w:sz w:val="19"/>
               </w:rPr>
-              <w:t>Configurada sobre o quadro real, sem reiniciar</w:t>
+              <w:t>Configurada sobre o quadro real da câmera, sem reiniciar o sistema</w:t>
             </w:r>
           </w:p>
         </w:tc>
@@ -642,7 +667,7 @@
               <w:rPr>
                 <w:sz w:val="19"/>
               </w:rPr>
-              <w:t>Stream principal × secundário</w:t>
+              <w:t>Credenciais distintas por lote</w:t>
             </w:r>
           </w:p>
         </w:tc>
@@ -655,7 +680,7 @@
               <w:rPr>
                 <w:sz w:val="19"/>
               </w:rPr>
-              <w:t>Secundário (640×480) adotado por estabilidade</w:t>
+              <w:t>Suportadas: dois conjuntos de senha na mesma planta</w:t>
             </w:r>
           </w:p>
         </w:tc>
@@ -670,7 +695,7 @@
               <w:rPr>
                 <w:sz w:val="19"/>
               </w:rPr>
-              <w:t>Terceira câmera prevista</w:t>
+              <w:t>Dissipação térmica do notebook</w:t>
             </w:r>
           </w:p>
         </w:tc>
@@ -683,7 +708,7 @@
               <w:rPr>
                 <w:sz w:val="19"/>
               </w:rPr>
-              <w:t>Endereço inexistente na rede; host inacessível</w:t>
+              <w:t>Limitação de hardware identificada e tratada — ver seção 10.3</w:t>
             </w:r>
           </w:p>
         </w:tc>
@@ -725,6 +750,7 @@
         <w:rPr>
           <w:b/>
         </w:rPr>
+        <w:lastRenderedPageBreak/>
         <w:t xml:space="preserve">Endereçamento volátil. </w:t>
       </w:r>
       <w:r>
@@ -780,8 +806,74 @@
         <w:jc w:val="both"/>
       </w:pPr>
       <w:r>
-        <w:lastRenderedPageBreak/>
         <w:t>A experiência motivou a criação de utilitários que reduzem o tempo de implantação de horas para minutos, e que passam a fazer parte do produto: verificação de alcance e de entrega efetiva de quadro por câmera; varredura da sub-rede em busca de câmeras ativas; e captura de uma imagem de cada câmera encontrada, permitindo identificar visualmente qual endereço corresponde a qual área da planta.</w:t>
+      </w:r>
+    </w:p>
+    <w:p>
+      <w:pPr>
+        <w:spacing w:before="120" w:after="40"/>
+      </w:pPr>
+      <w:r>
+        <w:rPr>
+          <w:b/>
+          <w:color w:val="1D1D1F"/>
+          <w:sz w:val="23"/>
+        </w:rPr>
+        <w:t>10.3 Limitação térmica do hardware de demonstração</w:t>
+      </w:r>
+    </w:p>
+    <w:p>
+      <w:pPr>
+        <w:spacing w:after="80"/>
+        <w:jc w:val="both"/>
+      </w:pPr>
+      <w:r>
+        <w:rPr>
+          <w:b/>
+        </w:rPr>
+        <w:t xml:space="preserve">O que ocorreu. </w:t>
+      </w:r>
+      <w:r>
+        <w:t>Na apresentação final, após aproximadamente quinze minutos de operação contínua com as cinco estações ativas e análise de postura em todas, a taxa de quadros caiu de forma acentuada. A hipótese inicial foi de latência de rede, mas a inspeção do equipamento ao final revelou a causa real: o notebook estava apoiado sobre a maleta de transporte em tecido, que obstruiu as entradas e a saída de ar do sistema de refrigeração.</w:t>
+      </w:r>
+    </w:p>
+    <w:p>
+      <w:pPr>
+        <w:spacing w:after="80"/>
+        <w:jc w:val="both"/>
+      </w:pPr>
+      <w:r>
+        <w:rPr>
+          <w:b/>
+        </w:rPr>
+        <w:t xml:space="preserve">Causa raiz. </w:t>
+      </w:r>
+      <w:r>
+        <w:t>Trata-se de limitação térmica de hardware, não de software. Com as saídas obstruídas, a temperatura da GPU atinge o limite de projeto e o controlador reduz a frequência de operação — o chamado afunilamento térmico. A carga de inferência permanece a mesma, mas a capacidade de processamento cai, e com ela a taxa de quadros. Nenhum componente do sistema falhou: o diagnóstico é de dissipação insuficiente por obstrução física.</w:t>
+      </w:r>
+    </w:p>
+    <w:p>
+      <w:pPr>
+        <w:spacing w:after="80"/>
+        <w:jc w:val="both"/>
+      </w:pPr>
+      <w:r>
+        <w:rPr>
+          <w:b/>
+        </w:rPr>
+        <w:t xml:space="preserve">Medidas adotadas. </w:t>
+      </w:r>
+      <w:r>
+        <w:t>Três medidas eliminam a recorrência. A primeira é operacional: o equipamento passa a ser apoiado sempre sobre superfície rígida e plana, com as aberturas de ventilação desobstruídas e espaço livre atrás da exaustão. A segunda é de hardware: foi adquirida uma base de refrigeração ativa (C3Tech NBC-100BK, compatível com notebooks de até 17,3 polegadas, com ventiladores de 125 e 70 milímetros e controle de velocidade), que força ar para as entradas e eleva o equipamento, ampliando o volume de ar disponível para troca térmica.</w:t>
+      </w:r>
+    </w:p>
+    <w:p>
+      <w:pPr>
+        <w:spacing w:after="80"/>
+        <w:jc w:val="both"/>
+      </w:pPr>
+      <w:r>
+        <w:t>A terceira é de software e já estava implementada: a análise de postura é suspensa automaticamente nas janelas minimizadas, concentrando o processamento na estação exibida. Foi com esse recurso que as cinco câmeras operaram a trinta quadros por segundo na própria planta. Complementarmente, foi incorporado um monitor térmico de leitura apenas, que exibe temperatura, frequência e utilização da GPU e sinaliza o início do afunilamento — permitindo verificar a condição térmica antes de cada apresentação, em vez de constatá-la pela queda de desempenho.</w:t>
       </w:r>
     </w:p>
     <w:p>
@@ -825,7 +917,8 @@
         <w:jc w:val="both"/>
       </w:pPr>
       <w:r>
-        <w:t xml:space="preserve">A fusão multi-câmera opera por estação; o casamento geométrico da mesma pessoa entre ângulos (homografia) permanece como incremento futuro. Os painéis de auditoria e de fusão são hoje acessíveis por API e linha de comando, e ganhariam com visualização no próprio dashboard. </w:t>
+        <w:lastRenderedPageBreak/>
+        <w:t>A fusão multi-câmera opera por estação; o casamento geométrico da mesma pessoa entre ângulos (homografia) permanece como incremento futuro. Os painéis de auditoria e de fusão são hoje acessíveis por API e linha de comando, e ganhariam com visualização no próprio dashboard. Por fim, a automação do backup da base de produção é o próximo item de operação.</w:t>
       </w:r>
     </w:p>
     <w:sectPr>

</xml_diff>